<commit_message>
Revert report to text-only screenshot placeholders; add PPT matching sample format
- Word report: removed embedded screenshots, restored plain text
  '(Insert Screenshot Here)' placeholders as originally requested
- New generate_ppt.py builds FinGenius_AI_Seminar_Presentation.pptx by
  reusing the sample PPT's theme/master/layouts (same title slide style,
  footer/date/slide-number placeholders on every slide, bullet + sub-bullet
  content slides, table slides, and a boxes-and-arrows architecture diagram
  slide) with all content replaced by FinGenius AI project material
- 24 slides: title, outline, problem statement, introduction, existing
  methods table, proposed system, architecture (text + diagram), workflow,
  module descriptions (auth, dashboard, expenses/income, budget/goals,
  analytics, AI chat, OCR/voice, database), tech stack table, advantages,
  limitations, comparison table, future work, conclusion
</commit_message>
<xml_diff>
--- a/FinGenius_AI_Mini_Project_Viva_Report_Generated.docx
+++ b/FinGenius_AI_Mini_Project_Viva_Report_Generated.docx
@@ -2029,89 +2029,15 @@
         <w:jc w:val="center"/>
       </w:pPr>
       <w:r>
-        <w:drawing>
-          <wp:inline xmlns:a="http://schemas.openxmlformats.org/drawingml/2006/main" xmlns:pic="http://schemas.openxmlformats.org/drawingml/2006/picture">
-            <wp:extent cx="5029200" cy="2407455"/>
-            <wp:docPr id="1" name="Picture 1"/>
-            <wp:cNvGraphicFramePr>
-              <a:graphicFrameLocks noChangeAspect="1"/>
-            </wp:cNvGraphicFramePr>
-            <a:graphic>
-              <a:graphicData uri="http://schemas.openxmlformats.org/drawingml/2006/picture">
-                <pic:pic>
-                  <pic:nvPicPr>
-                    <pic:cNvPr id="0" name="Screenshot 2026-07-13 195649.png"/>
-                    <pic:cNvPicPr/>
-                  </pic:nvPicPr>
-                  <pic:blipFill>
-                    <a:blip r:embed="rId9"/>
-                    <a:stretch>
-                      <a:fillRect/>
-                    </a:stretch>
-                  </pic:blipFill>
-                  <pic:spPr>
-                    <a:xfrm>
-                      <a:off x="0" y="0"/>
-                      <a:ext cx="5029200" cy="2407455"/>
-                    </a:xfrm>
-                    <a:prstGeom prst="rect"/>
-                  </pic:spPr>
-                </pic:pic>
-              </a:graphicData>
-            </a:graphic>
-          </wp:inline>
-        </w:drawing>
-      </w:r>
-    </w:p>
-    <w:p>
-      <w:pPr>
-        <w:jc w:val="center"/>
-      </w:pPr>
-      <w:r>
         <w:rPr>
           <w:i/>
           <w:sz w:val="22"/>
         </w:rPr>
+        <w:br/>
         <w:t>Figure 3.3 Landing Page</w:t>
-      </w:r>
-    </w:p>
-    <w:p>
-      <w:pPr>
-        <w:jc w:val="center"/>
-      </w:pPr>
-      <w:r>
-        <w:drawing>
-          <wp:inline xmlns:a="http://schemas.openxmlformats.org/drawingml/2006/main" xmlns:pic="http://schemas.openxmlformats.org/drawingml/2006/picture">
-            <wp:extent cx="5029200" cy="2415182"/>
-            <wp:docPr id="2" name="Picture 2"/>
-            <wp:cNvGraphicFramePr>
-              <a:graphicFrameLocks noChangeAspect="1"/>
-            </wp:cNvGraphicFramePr>
-            <a:graphic>
-              <a:graphicData uri="http://schemas.openxmlformats.org/drawingml/2006/picture">
-                <pic:pic>
-                  <pic:nvPicPr>
-                    <pic:cNvPr id="0" name="Screenshot 2026-07-13 195756.png"/>
-                    <pic:cNvPicPr/>
-                  </pic:nvPicPr>
-                  <pic:blipFill>
-                    <a:blip r:embed="rId10"/>
-                    <a:stretch>
-                      <a:fillRect/>
-                    </a:stretch>
-                  </pic:blipFill>
-                  <pic:spPr>
-                    <a:xfrm>
-                      <a:off x="0" y="0"/>
-                      <a:ext cx="5029200" cy="2415182"/>
-                    </a:xfrm>
-                    <a:prstGeom prst="rect"/>
-                  </pic:spPr>
-                </pic:pic>
-              </a:graphicData>
-            </a:graphic>
-          </wp:inline>
-        </w:drawing>
+        <w:br/>
+        <w:t>(Insert Screenshot Here)</w:t>
+        <w:br/>
       </w:r>
     </w:p>
     <w:p>
@@ -2123,7 +2049,11 @@
           <w:i/>
           <w:sz w:val="22"/>
         </w:rPr>
+        <w:br/>
         <w:t>Figure 3.4 Registration Page</w:t>
+        <w:br/>
+        <w:t>(Insert Screenshot Here)</w:t>
+        <w:br/>
       </w:r>
     </w:p>
     <w:p>
@@ -2183,50 +2113,15 @@
         <w:jc w:val="center"/>
       </w:pPr>
       <w:r>
-        <w:drawing>
-          <wp:inline xmlns:a="http://schemas.openxmlformats.org/drawingml/2006/main" xmlns:pic="http://schemas.openxmlformats.org/drawingml/2006/picture">
-            <wp:extent cx="5029200" cy="2391969"/>
-            <wp:docPr id="3" name="Picture 3"/>
-            <wp:cNvGraphicFramePr>
-              <a:graphicFrameLocks noChangeAspect="1"/>
-            </wp:cNvGraphicFramePr>
-            <a:graphic>
-              <a:graphicData uri="http://schemas.openxmlformats.org/drawingml/2006/picture">
-                <pic:pic>
-                  <pic:nvPicPr>
-                    <pic:cNvPr id="0" name="Screenshot 2026-07-13 205528.png"/>
-                    <pic:cNvPicPr/>
-                  </pic:nvPicPr>
-                  <pic:blipFill>
-                    <a:blip r:embed="rId11"/>
-                    <a:stretch>
-                      <a:fillRect/>
-                    </a:stretch>
-                  </pic:blipFill>
-                  <pic:spPr>
-                    <a:xfrm>
-                      <a:off x="0" y="0"/>
-                      <a:ext cx="5029200" cy="2391969"/>
-                    </a:xfrm>
-                    <a:prstGeom prst="rect"/>
-                  </pic:spPr>
-                </pic:pic>
-              </a:graphicData>
-            </a:graphic>
-          </wp:inline>
-        </w:drawing>
-      </w:r>
-    </w:p>
-    <w:p>
-      <w:pPr>
-        <w:jc w:val="center"/>
-      </w:pPr>
-      <w:r>
         <w:rPr>
           <w:i/>
           <w:sz w:val="22"/>
         </w:rPr>
+        <w:br/>
         <w:t>Figure 3.5 Dashboard Overview</w:t>
+        <w:br/>
+        <w:t>(Insert Screenshot Here)</w:t>
+        <w:br/>
       </w:r>
     </w:p>
     <w:p>
@@ -2302,50 +2197,15 @@
         <w:jc w:val="center"/>
       </w:pPr>
       <w:r>
-        <w:drawing>
-          <wp:inline xmlns:a="http://schemas.openxmlformats.org/drawingml/2006/main" xmlns:pic="http://schemas.openxmlformats.org/drawingml/2006/picture">
-            <wp:extent cx="5029200" cy="2411478"/>
-            <wp:docPr id="4" name="Picture 4"/>
-            <wp:cNvGraphicFramePr>
-              <a:graphicFrameLocks noChangeAspect="1"/>
-            </wp:cNvGraphicFramePr>
-            <a:graphic>
-              <a:graphicData uri="http://schemas.openxmlformats.org/drawingml/2006/picture">
-                <pic:pic>
-                  <pic:nvPicPr>
-                    <pic:cNvPr id="0" name="Screenshot 2026-07-13 205600.png"/>
-                    <pic:cNvPicPr/>
-                  </pic:nvPicPr>
-                  <pic:blipFill>
-                    <a:blip r:embed="rId12"/>
-                    <a:stretch>
-                      <a:fillRect/>
-                    </a:stretch>
-                  </pic:blipFill>
-                  <pic:spPr>
-                    <a:xfrm>
-                      <a:off x="0" y="0"/>
-                      <a:ext cx="5029200" cy="2411478"/>
-                    </a:xfrm>
-                    <a:prstGeom prst="rect"/>
-                  </pic:spPr>
-                </pic:pic>
-              </a:graphicData>
-            </a:graphic>
-          </wp:inline>
-        </w:drawing>
-      </w:r>
-    </w:p>
-    <w:p>
-      <w:pPr>
-        <w:jc w:val="center"/>
-      </w:pPr>
-      <w:r>
         <w:rPr>
           <w:i/>
           <w:sz w:val="22"/>
         </w:rPr>
+        <w:br/>
         <w:t>Figure 3.6 Expenses Page</w:t>
+        <w:br/>
+        <w:t>(Insert Screenshot Here)</w:t>
+        <w:br/>
       </w:r>
     </w:p>
     <w:p>
@@ -2413,50 +2273,15 @@
         <w:jc w:val="center"/>
       </w:pPr>
       <w:r>
-        <w:drawing>
-          <wp:inline xmlns:a="http://schemas.openxmlformats.org/drawingml/2006/main" xmlns:pic="http://schemas.openxmlformats.org/drawingml/2006/picture">
-            <wp:extent cx="5029200" cy="2402518"/>
-            <wp:docPr id="5" name="Picture 5"/>
-            <wp:cNvGraphicFramePr>
-              <a:graphicFrameLocks noChangeAspect="1"/>
-            </wp:cNvGraphicFramePr>
-            <a:graphic>
-              <a:graphicData uri="http://schemas.openxmlformats.org/drawingml/2006/picture">
-                <pic:pic>
-                  <pic:nvPicPr>
-                    <pic:cNvPr id="0" name="Screenshot 2026-07-13 205621.png"/>
-                    <pic:cNvPicPr/>
-                  </pic:nvPicPr>
-                  <pic:blipFill>
-                    <a:blip r:embed="rId13"/>
-                    <a:stretch>
-                      <a:fillRect/>
-                    </a:stretch>
-                  </pic:blipFill>
-                  <pic:spPr>
-                    <a:xfrm>
-                      <a:off x="0" y="0"/>
-                      <a:ext cx="5029200" cy="2402518"/>
-                    </a:xfrm>
-                    <a:prstGeom prst="rect"/>
-                  </pic:spPr>
-                </pic:pic>
-              </a:graphicData>
-            </a:graphic>
-          </wp:inline>
-        </w:drawing>
-      </w:r>
-    </w:p>
-    <w:p>
-      <w:pPr>
-        <w:jc w:val="center"/>
-      </w:pPr>
-      <w:r>
         <w:rPr>
           <w:i/>
           <w:sz w:val="22"/>
         </w:rPr>
+        <w:br/>
         <w:t>Figure 3.7 Income Page</w:t>
+        <w:br/>
+        <w:t>(Insert Screenshot Here)</w:t>
+        <w:br/>
       </w:r>
     </w:p>
     <w:p>
@@ -2516,50 +2341,15 @@
         <w:jc w:val="center"/>
       </w:pPr>
       <w:r>
-        <w:drawing>
-          <wp:inline xmlns:a="http://schemas.openxmlformats.org/drawingml/2006/main" xmlns:pic="http://schemas.openxmlformats.org/drawingml/2006/picture">
-            <wp:extent cx="5029200" cy="2402518"/>
-            <wp:docPr id="6" name="Picture 6"/>
-            <wp:cNvGraphicFramePr>
-              <a:graphicFrameLocks noChangeAspect="1"/>
-            </wp:cNvGraphicFramePr>
-            <a:graphic>
-              <a:graphicData uri="http://schemas.openxmlformats.org/drawingml/2006/picture">
-                <pic:pic>
-                  <pic:nvPicPr>
-                    <pic:cNvPr id="0" name="Screenshot 2026-07-13 205641.png"/>
-                    <pic:cNvPicPr/>
-                  </pic:nvPicPr>
-                  <pic:blipFill>
-                    <a:blip r:embed="rId14"/>
-                    <a:stretch>
-                      <a:fillRect/>
-                    </a:stretch>
-                  </pic:blipFill>
-                  <pic:spPr>
-                    <a:xfrm>
-                      <a:off x="0" y="0"/>
-                      <a:ext cx="5029200" cy="2402518"/>
-                    </a:xfrm>
-                    <a:prstGeom prst="rect"/>
-                  </pic:spPr>
-                </pic:pic>
-              </a:graphicData>
-            </a:graphic>
-          </wp:inline>
-        </w:drawing>
-      </w:r>
-    </w:p>
-    <w:p>
-      <w:pPr>
-        <w:jc w:val="center"/>
-      </w:pPr>
-      <w:r>
         <w:rPr>
           <w:i/>
           <w:sz w:val="22"/>
         </w:rPr>
+        <w:br/>
         <w:t>Figure 3.8 Budget Planning Page</w:t>
+        <w:br/>
+        <w:t>(Insert Screenshot Here)</w:t>
+        <w:br/>
       </w:r>
     </w:p>
     <w:p>
@@ -2619,50 +2409,15 @@
         <w:jc w:val="center"/>
       </w:pPr>
       <w:r>
-        <w:drawing>
-          <wp:inline xmlns:a="http://schemas.openxmlformats.org/drawingml/2006/main" xmlns:pic="http://schemas.openxmlformats.org/drawingml/2006/picture">
-            <wp:extent cx="5029200" cy="2388671"/>
-            <wp:docPr id="7" name="Picture 7"/>
-            <wp:cNvGraphicFramePr>
-              <a:graphicFrameLocks noChangeAspect="1"/>
-            </wp:cNvGraphicFramePr>
-            <a:graphic>
-              <a:graphicData uri="http://schemas.openxmlformats.org/drawingml/2006/picture">
-                <pic:pic>
-                  <pic:nvPicPr>
-                    <pic:cNvPr id="0" name="Screenshot 2026-07-13 205704.png"/>
-                    <pic:cNvPicPr/>
-                  </pic:nvPicPr>
-                  <pic:blipFill>
-                    <a:blip r:embed="rId15"/>
-                    <a:stretch>
-                      <a:fillRect/>
-                    </a:stretch>
-                  </pic:blipFill>
-                  <pic:spPr>
-                    <a:xfrm>
-                      <a:off x="0" y="0"/>
-                      <a:ext cx="5029200" cy="2388671"/>
-                    </a:xfrm>
-                    <a:prstGeom prst="rect"/>
-                  </pic:spPr>
-                </pic:pic>
-              </a:graphicData>
-            </a:graphic>
-          </wp:inline>
-        </w:drawing>
-      </w:r>
-    </w:p>
-    <w:p>
-      <w:pPr>
-        <w:jc w:val="center"/>
-      </w:pPr>
-      <w:r>
         <w:rPr>
           <w:i/>
           <w:sz w:val="22"/>
         </w:rPr>
+        <w:br/>
         <w:t>Figure 3.9 Financial Goals Page</w:t>
+        <w:br/>
+        <w:t>(Insert Screenshot Here)</w:t>
+        <w:br/>
       </w:r>
     </w:p>
     <w:p>
@@ -2730,50 +2485,15 @@
         <w:jc w:val="center"/>
       </w:pPr>
       <w:r>
-        <w:drawing>
-          <wp:inline xmlns:a="http://schemas.openxmlformats.org/drawingml/2006/main" xmlns:pic="http://schemas.openxmlformats.org/drawingml/2006/picture">
-            <wp:extent cx="5029200" cy="2385036"/>
-            <wp:docPr id="8" name="Picture 8"/>
-            <wp:cNvGraphicFramePr>
-              <a:graphicFrameLocks noChangeAspect="1"/>
-            </wp:cNvGraphicFramePr>
-            <a:graphic>
-              <a:graphicData uri="http://schemas.openxmlformats.org/drawingml/2006/picture">
-                <pic:pic>
-                  <pic:nvPicPr>
-                    <pic:cNvPr id="0" name="Screenshot 2026-07-13 205724.png"/>
-                    <pic:cNvPicPr/>
-                  </pic:nvPicPr>
-                  <pic:blipFill>
-                    <a:blip r:embed="rId16"/>
-                    <a:stretch>
-                      <a:fillRect/>
-                    </a:stretch>
-                  </pic:blipFill>
-                  <pic:spPr>
-                    <a:xfrm>
-                      <a:off x="0" y="0"/>
-                      <a:ext cx="5029200" cy="2385036"/>
-                    </a:xfrm>
-                    <a:prstGeom prst="rect"/>
-                  </pic:spPr>
-                </pic:pic>
-              </a:graphicData>
-            </a:graphic>
-          </wp:inline>
-        </w:drawing>
-      </w:r>
-    </w:p>
-    <w:p>
-      <w:pPr>
-        <w:jc w:val="center"/>
-      </w:pPr>
-      <w:r>
         <w:rPr>
           <w:i/>
           <w:sz w:val="22"/>
         </w:rPr>
+        <w:br/>
         <w:t>Figure 3.10 Analytics Dashboard</w:t>
+        <w:br/>
+        <w:t>(Insert Screenshot Here)</w:t>
+        <w:br/>
       </w:r>
     </w:p>
     <w:p>
@@ -2841,50 +2561,15 @@
         <w:jc w:val="center"/>
       </w:pPr>
       <w:r>
-        <w:drawing>
-          <wp:inline xmlns:a="http://schemas.openxmlformats.org/drawingml/2006/main" xmlns:pic="http://schemas.openxmlformats.org/drawingml/2006/picture">
-            <wp:extent cx="5029200" cy="2399518"/>
-            <wp:docPr id="9" name="Picture 9"/>
-            <wp:cNvGraphicFramePr>
-              <a:graphicFrameLocks noChangeAspect="1"/>
-            </wp:cNvGraphicFramePr>
-            <a:graphic>
-              <a:graphicData uri="http://schemas.openxmlformats.org/drawingml/2006/picture">
-                <pic:pic>
-                  <pic:nvPicPr>
-                    <pic:cNvPr id="0" name="Screenshot 2026-07-13 205745.png"/>
-                    <pic:cNvPicPr/>
-                  </pic:nvPicPr>
-                  <pic:blipFill>
-                    <a:blip r:embed="rId17"/>
-                    <a:stretch>
-                      <a:fillRect/>
-                    </a:stretch>
-                  </pic:blipFill>
-                  <pic:spPr>
-                    <a:xfrm>
-                      <a:off x="0" y="0"/>
-                      <a:ext cx="5029200" cy="2399518"/>
-                    </a:xfrm>
-                    <a:prstGeom prst="rect"/>
-                  </pic:spPr>
-                </pic:pic>
-              </a:graphicData>
-            </a:graphic>
-          </wp:inline>
-        </w:drawing>
-      </w:r>
-    </w:p>
-    <w:p>
-      <w:pPr>
-        <w:jc w:val="center"/>
-      </w:pPr>
-      <w:r>
         <w:rPr>
           <w:i/>
           <w:sz w:val="22"/>
         </w:rPr>
+        <w:br/>
         <w:t>Figure 3.11 AI Chat Interface</w:t>
+        <w:br/>
+        <w:t>(Insert Screenshot Here)</w:t>
+        <w:br/>
       </w:r>
     </w:p>
     <w:p>

</xml_diff>